<commit_message>
Added UML classes diagram files
</commit_message>
<xml_diff>
--- a/requisitos/Levantamento de Requisitos de Software_v1.docx
+++ b/requisitos/Levantamento de Requisitos de Software_v1.docx
@@ -47,7 +47,31 @@
         <w:jc w:val="both"/>
       </w:pPr>
       <w:r>
-        <w:t>O MVP — Minimum Viable Product ou Produto Mínimo Viável — é uma versão inicial de um produto que contém apenas as funcionalidades essenciais para que ele possa ser testado e utilizado, validando hipóteses e recebendo feedback dos usuários reais. O objetivo do MVP é lançar o produto rapidamente, com o menor investimento possível, permitindo que a organização evolua o sistema de acordo com as necessidades identificadas na prática.</w:t>
+        <w:t xml:space="preserve">O MVP — </w:t>
+      </w:r>
+      <w:proofErr w:type="spellStart"/>
+      <w:r>
+        <w:t>Minimum</w:t>
+      </w:r>
+      <w:proofErr w:type="spellEnd"/>
+      <w:r>
+        <w:t xml:space="preserve"> </w:t>
+      </w:r>
+      <w:proofErr w:type="spellStart"/>
+      <w:r>
+        <w:t>Viable</w:t>
+      </w:r>
+      <w:proofErr w:type="spellEnd"/>
+      <w:r>
+        <w:t xml:space="preserve"> </w:t>
+      </w:r>
+      <w:proofErr w:type="spellStart"/>
+      <w:r>
+        <w:t>Product</w:t>
+      </w:r>
+      <w:proofErr w:type="spellEnd"/>
+      <w:r>
+        <w:t xml:space="preserve"> ou Produto Mínimo Viável — é uma versão inicial de um produto que contém apenas as funcionalidades essenciais para que ele possa ser testado e utilizado, validando hipóteses e recebendo feedback dos usuários reais. O objetivo do MVP é lançar o produto rapidamente, com o menor investimento possível, permitindo que a organização evolua o sistema de acordo com as necessidades identificadas na prática.</w:t>
       </w:r>
     </w:p>
     <w:p>
@@ -299,7 +323,7 @@
         <w:jc w:val="both"/>
       </w:pPr>
       <w:r>
-        <w:t>Doado</w:t>
+        <w:t>Adotado</w:t>
       </w:r>
     </w:p>
     <w:p>
@@ -470,9 +494,14 @@
         </w:numPr>
         <w:jc w:val="both"/>
       </w:pPr>
+      <w:proofErr w:type="spellStart"/>
       <w:r>
         <w:lastRenderedPageBreak/>
-        <w:t>bio – campo para armazenar breve história do colaborador</w:t>
+        <w:t>bio</w:t>
+      </w:r>
+      <w:proofErr w:type="spellEnd"/>
+      <w:r>
+        <w:t xml:space="preserve"> – campo para armazenar breve história do colaborador</w:t>
       </w:r>
     </w:p>
     <w:p>
@@ -485,7 +514,15 @@
         <w:jc w:val="both"/>
       </w:pPr>
       <w:r>
-        <w:t>função — Papel desempenhado dentro da ONG (ex: voluntário, veterinário, coordenador)</w:t>
+        <w:t>função — Papel desempenhado dentro da ONG (</w:t>
+      </w:r>
+      <w:proofErr w:type="spellStart"/>
+      <w:r>
+        <w:t>ex</w:t>
+      </w:r>
+      <w:proofErr w:type="spellEnd"/>
+      <w:r>
+        <w:t>: voluntário, veterinário, coordenador)</w:t>
       </w:r>
     </w:p>
     <w:p>
@@ -659,8 +696,13 @@
         </w:numPr>
         <w:jc w:val="both"/>
       </w:pPr>
-      <w:r>
-        <w:t>id_prescricao — Identificador único da prescrição</w:t>
+      <w:proofErr w:type="spellStart"/>
+      <w:r>
+        <w:t>id_prescricao</w:t>
+      </w:r>
+      <w:proofErr w:type="spellEnd"/>
+      <w:r>
+        <w:t xml:space="preserve"> — Identificador único da prescrição</w:t>
       </w:r>
     </w:p>
     <w:p>
@@ -672,8 +714,13 @@
         </w:numPr>
         <w:jc w:val="both"/>
       </w:pPr>
-      <w:r>
-        <w:t>data_inicio — Data em que a prescrição foi iniciada</w:t>
+      <w:proofErr w:type="spellStart"/>
+      <w:r>
+        <w:t>data_inicio</w:t>
+      </w:r>
+      <w:proofErr w:type="spellEnd"/>
+      <w:r>
+        <w:t xml:space="preserve"> — Data em que a prescrição foi iniciada</w:t>
       </w:r>
     </w:p>
     <w:p>
@@ -685,8 +732,13 @@
         </w:numPr>
         <w:jc w:val="both"/>
       </w:pPr>
-      <w:r>
-        <w:t>id_animal — Identificador do animal relacionado (chave estrangeira vinculada ao cadastro de animais)</w:t>
+      <w:proofErr w:type="spellStart"/>
+      <w:r>
+        <w:t>id_animal</w:t>
+      </w:r>
+      <w:proofErr w:type="spellEnd"/>
+      <w:r>
+        <w:t xml:space="preserve"> — Identificador do animal relacionado (chave estrangeira vinculada ao cadastro de animais)</w:t>
       </w:r>
     </w:p>
     <w:p>
@@ -698,8 +750,13 @@
         </w:numPr>
         <w:jc w:val="both"/>
       </w:pPr>
-      <w:r>
-        <w:t>medicamento_prescrito — Nome do medicamento</w:t>
+      <w:proofErr w:type="spellStart"/>
+      <w:r>
+        <w:t>medicamento_prescrito</w:t>
+      </w:r>
+      <w:proofErr w:type="spellEnd"/>
+      <w:r>
+        <w:t xml:space="preserve"> — Nome do medicamento</w:t>
       </w:r>
     </w:p>
     <w:p>
@@ -724,8 +781,13 @@
         </w:numPr>
         <w:jc w:val="both"/>
       </w:pPr>
-      <w:r>
-        <w:t>modo_administracao — Descrição da via e forma de administração do medicamento</w:t>
+      <w:proofErr w:type="spellStart"/>
+      <w:r>
+        <w:t>modo_administracao</w:t>
+      </w:r>
+      <w:proofErr w:type="spellEnd"/>
+      <w:r>
+        <w:t xml:space="preserve"> — Descrição da via e forma de administração do medicamento</w:t>
       </w:r>
     </w:p>
     <w:p>
@@ -737,8 +799,21 @@
         </w:numPr>
         <w:jc w:val="both"/>
       </w:pPr>
-      <w:r>
-        <w:t>frequencia — Periodicidade da administração (ex: 2x ao dia)</w:t>
+      <w:proofErr w:type="spellStart"/>
+      <w:r>
+        <w:t>frequencia</w:t>
+      </w:r>
+      <w:proofErr w:type="spellEnd"/>
+      <w:r>
+        <w:t xml:space="preserve"> — Periodicidade da administração (</w:t>
+      </w:r>
+      <w:proofErr w:type="spellStart"/>
+      <w:r>
+        <w:t>ex</w:t>
+      </w:r>
+      <w:proofErr w:type="spellEnd"/>
+      <w:r>
+        <w:t>: 2x ao dia)</w:t>
       </w:r>
     </w:p>
     <w:p>
@@ -750,8 +825,13 @@
         </w:numPr>
         <w:jc w:val="both"/>
       </w:pPr>
-      <w:r>
-        <w:t>duracao_dias — Número de dias de duração do tratamento</w:t>
+      <w:proofErr w:type="spellStart"/>
+      <w:r>
+        <w:t>duracao_dias</w:t>
+      </w:r>
+      <w:proofErr w:type="spellEnd"/>
+      <w:r>
+        <w:t xml:space="preserve"> — Número de dias de duração do tratamento</w:t>
       </w:r>
     </w:p>
     <w:p>
@@ -843,7 +923,15 @@
         <w:jc w:val="both"/>
       </w:pPr>
       <w:r>
-        <w:t>Este módulo centraliza o cadastro e a gestão dos procedimentos médicos realizados na ONG, como vacinas, vermifugações, castrações e testes (exemplo: FIV/FeLV).</w:t>
+        <w:t>Este módulo centraliza o cadastro e a gestão dos procedimentos médicos realizados na ONG, como vacinas, vermifugações, castrações e testes (exemplo: FIV/</w:t>
+      </w:r>
+      <w:proofErr w:type="spellStart"/>
+      <w:r>
+        <w:t>FeLV</w:t>
+      </w:r>
+      <w:proofErr w:type="spellEnd"/>
+      <w:r>
+        <w:t>).</w:t>
       </w:r>
     </w:p>
     <w:p>
@@ -863,8 +951,13 @@
         </w:numPr>
         <w:jc w:val="both"/>
       </w:pPr>
-      <w:r>
-        <w:t>id_procedimento — Identificador único do procedimento</w:t>
+      <w:proofErr w:type="spellStart"/>
+      <w:r>
+        <w:t>id_procedimento</w:t>
+      </w:r>
+      <w:proofErr w:type="spellEnd"/>
+      <w:r>
+        <w:t xml:space="preserve"> — Identificador único do procedimento</w:t>
       </w:r>
     </w:p>
     <w:p>
@@ -876,8 +969,29 @@
         </w:numPr>
         <w:jc w:val="both"/>
       </w:pPr>
-      <w:r>
-        <w:t>nome_procedimento — Nome do procedimento (ex: vacina antirrábica, vermifugação, castração, teste FIV/FeLV, etc.)</w:t>
+      <w:proofErr w:type="spellStart"/>
+      <w:r>
+        <w:t>nome_procedimento</w:t>
+      </w:r>
+      <w:proofErr w:type="spellEnd"/>
+      <w:r>
+        <w:t xml:space="preserve"> — Nome do procedimento (</w:t>
+      </w:r>
+      <w:proofErr w:type="spellStart"/>
+      <w:r>
+        <w:t>ex</w:t>
+      </w:r>
+      <w:proofErr w:type="spellEnd"/>
+      <w:r>
+        <w:t>: vacina antirrábica, vermifugação, castração, teste FIV/</w:t>
+      </w:r>
+      <w:proofErr w:type="spellStart"/>
+      <w:r>
+        <w:t>FeLV</w:t>
+      </w:r>
+      <w:proofErr w:type="spellEnd"/>
+      <w:r>
+        <w:t>, etc.)</w:t>
       </w:r>
     </w:p>
     <w:p>
@@ -889,8 +1003,13 @@
         </w:numPr>
         <w:jc w:val="both"/>
       </w:pPr>
-      <w:r>
-        <w:t>descricao — Descrição detalhada do procedimento</w:t>
+      <w:proofErr w:type="spellStart"/>
+      <w:r>
+        <w:t>descricao</w:t>
+      </w:r>
+      <w:proofErr w:type="spellEnd"/>
+      <w:r>
+        <w:t xml:space="preserve"> — Descrição detalhada do procedimento</w:t>
       </w:r>
     </w:p>
     <w:p>
@@ -957,8 +1076,13 @@
         </w:numPr>
         <w:jc w:val="both"/>
       </w:pPr>
-      <w:r>
-        <w:t>id_realizacao_procedimento — Identificador único do registro de realização</w:t>
+      <w:proofErr w:type="spellStart"/>
+      <w:r>
+        <w:t>id_realizacao_procedimento</w:t>
+      </w:r>
+      <w:proofErr w:type="spellEnd"/>
+      <w:r>
+        <w:t xml:space="preserve"> — Identificador único do registro de realização</w:t>
       </w:r>
     </w:p>
     <w:p>
@@ -970,8 +1094,13 @@
         </w:numPr>
         <w:jc w:val="both"/>
       </w:pPr>
-      <w:r>
-        <w:t>id_procedimento — Identificador do procedimento realizado (chave estrangeira para o módulo de procedimentos médicos)</w:t>
+      <w:proofErr w:type="spellStart"/>
+      <w:r>
+        <w:t>id_procedimento</w:t>
+      </w:r>
+      <w:proofErr w:type="spellEnd"/>
+      <w:r>
+        <w:t xml:space="preserve"> — Identificador do procedimento realizado (chave estrangeira para o módulo de procedimentos médicos)</w:t>
       </w:r>
     </w:p>
     <w:p>
@@ -983,8 +1112,13 @@
         </w:numPr>
         <w:jc w:val="both"/>
       </w:pPr>
-      <w:r>
-        <w:t>id_animal_atendido — Identificador do animal que recebeu o procedimento (chave estrangeira para o cadastro de animais)</w:t>
+      <w:proofErr w:type="spellStart"/>
+      <w:r>
+        <w:t>id_animal_atendido</w:t>
+      </w:r>
+      <w:proofErr w:type="spellEnd"/>
+      <w:r>
+        <w:t xml:space="preserve"> — Identificador do animal que recebeu o procedimento (chave estrangeira para o cadastro de animais)</w:t>
       </w:r>
     </w:p>
     <w:p>
@@ -996,8 +1130,13 @@
         </w:numPr>
         <w:jc w:val="both"/>
       </w:pPr>
-      <w:r>
-        <w:t>data_realizacao — Data em que o procedimento foi realizado</w:t>
+      <w:proofErr w:type="spellStart"/>
+      <w:r>
+        <w:t>data_realizacao</w:t>
+      </w:r>
+      <w:proofErr w:type="spellEnd"/>
+      <w:r>
+        <w:t xml:space="preserve"> — Data em que o procedimento foi realizado</w:t>
       </w:r>
     </w:p>
     <w:p>
@@ -1009,8 +1148,13 @@
         </w:numPr>
         <w:jc w:val="both"/>
       </w:pPr>
-      <w:r>
-        <w:t>observacoes — Campo para anotações complementares ou informações relevantes sobre o procedimento</w:t>
+      <w:proofErr w:type="spellStart"/>
+      <w:r>
+        <w:t>observacoes</w:t>
+      </w:r>
+      <w:proofErr w:type="spellEnd"/>
+      <w:r>
+        <w:t xml:space="preserve"> — Campo para anotações complementares ou informações relevantes sobre o procedimento</w:t>
       </w:r>
     </w:p>
     <w:p>
@@ -1107,7 +1251,15 @@
         <w:t xml:space="preserve"> transparência e organização em seus processos. </w:t>
       </w:r>
       <w:r>
-        <w:t>Importante ressaltar que o software entregue na primeira rodada de implementação (MVP) pode eveluir conforme</w:t>
+        <w:t xml:space="preserve">Importante ressaltar que o software entregue na primeira rodada de implementação (MVP) pode </w:t>
+      </w:r>
+      <w:proofErr w:type="spellStart"/>
+      <w:r>
+        <w:t>eveluir</w:t>
+      </w:r>
+      <w:proofErr w:type="spellEnd"/>
+      <w:r>
+        <w:t xml:space="preserve"> conforme</w:t>
       </w:r>
       <w:r>
         <w:t xml:space="preserve"> </w:t>

</xml_diff>